<commit_message>
Updated iteration (almost final)
</commit_message>
<xml_diff>
--- a/Agentic_Replenishment_Change_Log.docx
+++ b/Agentic_Replenishment_Change_Log.docx
@@ -230,7 +230,7 @@
                 <w:sz w:val="20"/>
                 <w:szCs w:val="20"/>
               </w:rPr>
-              <w:t xml:space="preserve">15</w:t>
+              <w:t xml:space="preserve">17</w:t>
             </w:r>
           </w:p>
         </w:tc>
@@ -294,7 +294,7 @@
                 <w:sz w:val="20"/>
                 <w:szCs w:val="20"/>
               </w:rPr>
-              <w:t xml:space="preserve">9</w:t>
+              <w:t xml:space="preserve">10</w:t>
             </w:r>
           </w:p>
         </w:tc>
@@ -484,7 +484,7 @@
                 <w:sz w:val="20"/>
                 <w:szCs w:val="20"/>
               </w:rPr>
-              <w:t xml:space="preserve">15</w:t>
+              <w:t xml:space="preserve">14</w:t>
             </w:r>
           </w:p>
         </w:tc>
@@ -1672,6 +1672,192 @@
           <w:szCs w:val="21"/>
         </w:rPr>
         <w:t xml:space="preserve">Exposure ordering: APP-1042 26,172; FTW-3301 22,338; FTW-3302 19,945; FTW-3350 4,636. The flagged set is unchanged at 4 of 15 — only the order differs on this dataset.</w:t>
+      </w:r>
+    </w:p>
+    <w:p>
+      <w:pPr>
+        <w:pStyle w:val="Heading3"/>
+        <w:spacing w:after="100" w:before="220"/>
+      </w:pPr>
+      <w:r>
+        <w:t xml:space="preserve">A16. Urgency alerts could never clear</w:t>
+      </w:r>
+    </w:p>
+    <w:p>
+      <w:pPr>
+        <w:spacing w:after="100"/>
+      </w:pPr>
+      <w:r>
+        <w:rPr>
+          <w:b/>
+          <w:bCs/>
+          <w:sz w:val="21"/>
+          <w:szCs w:val="21"/>
+        </w:rPr>
+        <w:t xml:space="preserve">What was wrong:  </w:t>
+      </w:r>
+      <w:r>
+        <w:rPr>
+          <w:sz w:val="21"/>
+          <w:szCs w:val="21"/>
+        </w:rPr>
+        <w:t xml:space="preserve">The stockout calculation measured the gap between days of cover and lead time — the lead time of a hypothetical order placed today. It had no concept of stock already in transit.</w:t>
+      </w:r>
+    </w:p>
+    <w:p>
+      <w:pPr>
+        <w:spacing w:after="100"/>
+      </w:pPr>
+      <w:r>
+        <w:rPr>
+          <w:b/>
+          <w:bCs/>
+          <w:sz w:val="21"/>
+          <w:szCs w:val="21"/>
+        </w:rPr>
+        <w:t xml:space="preserve">Why it mattered:  </w:t>
+      </w:r>
+      <w:r>
+        <w:rPr>
+          <w:sz w:val="21"/>
+          <w:szCs w:val="21"/>
+        </w:rPr>
+        <w:t xml:space="preserve">A SKU flagged short stayed flagged on every subsequent run until physical stock arrived, regardless of whether a planner had approved a purchase order for it the day before. The same items reappear indefinitely with no acknowledged state, which is the standard route to alert fatigue and to a queue people stop reading.</w:t>
+      </w:r>
+    </w:p>
+    <w:p>
+      <w:pPr>
+        <w:spacing w:after="100"/>
+      </w:pPr>
+      <w:r>
+        <w:rPr>
+          <w:b/>
+          <w:bCs/>
+          <w:sz w:val="21"/>
+          <w:szCs w:val="21"/>
+        </w:rPr>
+        <w:t xml:space="preserve">What changed:  </w:t>
+      </w:r>
+      <w:r>
+        <w:rPr>
+          <w:sz w:val="21"/>
+          <w:szCs w:val="21"/>
+        </w:rPr>
+        <w:t xml:space="preserve">The inventory snapshot now carries open purchase orders, and the shortage horizon runs to the next actual arrival rather than a hypothetical one.</w:t>
+      </w:r>
+    </w:p>
+    <w:p>
+      <w:pPr>
+        <w:spacing w:after="100"/>
+      </w:pPr>
+      <w:r>
+        <w:rPr>
+          <w:b/>
+          <w:bCs/>
+          <w:sz w:val="21"/>
+          <w:szCs w:val="21"/>
+        </w:rPr>
+        <w:t xml:space="preserve">Evidence:  </w:t>
+      </w:r>
+      <w:r>
+        <w:rPr>
+          <w:sz w:val="21"/>
+          <w:szCs w:val="21"/>
+        </w:rPr>
+        <w:t xml:space="preserve">FTW-3350 has a purchase order arriving in 12 days against 17.6 days of remaining cover, so its projected gap is zero and it correctly drops out of the urgent list. Urgent count falls from 4 of 15 to 3 of 15.</w:t>
+      </w:r>
+    </w:p>
+    <w:p>
+      <w:pPr>
+        <w:pStyle w:val="Heading3"/>
+        <w:spacing w:after="100" w:before="220"/>
+      </w:pPr>
+      <w:r>
+        <w:t xml:space="preserve">A17. Reorders double-counted demand already on order</w:t>
+      </w:r>
+    </w:p>
+    <w:p>
+      <w:pPr>
+        <w:spacing w:after="100"/>
+      </w:pPr>
+      <w:r>
+        <w:rPr>
+          <w:b/>
+          <w:bCs/>
+          <w:sz w:val="21"/>
+          <w:szCs w:val="21"/>
+        </w:rPr>
+        <w:t xml:space="preserve">What was wrong:  </w:t>
+      </w:r>
+      <w:r>
+        <w:rPr>
+          <w:sz w:val="21"/>
+          <w:szCs w:val="21"/>
+        </w:rPr>
+        <w:t xml:space="preserve">Recommended quantities were netted against on-hand stock only, ignoring units already on an open purchase order.</w:t>
+      </w:r>
+    </w:p>
+    <w:p>
+      <w:pPr>
+        <w:spacing w:after="100"/>
+      </w:pPr>
+      <w:r>
+        <w:rPr>
+          <w:b/>
+          <w:bCs/>
+          <w:sz w:val="21"/>
+          <w:szCs w:val="21"/>
+        </w:rPr>
+        <w:t xml:space="preserve">Why it mattered:  </w:t>
+      </w:r>
+      <w:r>
+        <w:rPr>
+          <w:sz w:val="21"/>
+          <w:szCs w:val="21"/>
+        </w:rPr>
+        <w:t xml:space="preserve">The system re-ordered for demand an in-flight purchase order was already covering. This is a straightforward way to accumulate excess stock, and it compounds every cycle the order remains in transit.</w:t>
+      </w:r>
+    </w:p>
+    <w:p>
+      <w:pPr>
+        <w:spacing w:after="100"/>
+      </w:pPr>
+      <w:r>
+        <w:rPr>
+          <w:b/>
+          <w:bCs/>
+          <w:sz w:val="21"/>
+          <w:szCs w:val="21"/>
+        </w:rPr>
+        <w:t xml:space="preserve">What changed:  </w:t>
+      </w:r>
+      <w:r>
+        <w:rPr>
+          <w:sz w:val="21"/>
+          <w:szCs w:val="21"/>
+        </w:rPr>
+        <w:t xml:space="preserve">Reorder quantities now net against inventory position — on hand plus on order — in both the standard and the sparse-history branches.</w:t>
+      </w:r>
+    </w:p>
+    <w:p>
+      <w:pPr>
+        <w:spacing w:after="100"/>
+      </w:pPr>
+      <w:r>
+        <w:rPr>
+          <w:b/>
+          <w:bCs/>
+          <w:sz w:val="21"/>
+          <w:szCs w:val="21"/>
+        </w:rPr>
+        <w:t xml:space="preserve">Evidence:  </w:t>
+      </w:r>
+      <w:r>
+        <w:rPr>
+          <w:sz w:val="21"/>
+          <w:szCs w:val="21"/>
+        </w:rPr>
+        <w:t xml:space="preserve">Prevents a 79-unit double-order on FTW-3350, roughly 1,900 of stock at cost. On the other SKU with an open order the quantity is unchanged, because on-hand alone already exceeded the reorder point — the mechanism is correct but this dataset exercises it lightly.</w:t>
       </w:r>
     </w:p>
     <w:p>
@@ -1956,6 +2142,27 @@
           <w:szCs w:val="21"/>
         </w:rPr>
         <w:t xml:space="preserve">The review queue is sorted by revenue at risk rather than by SKU order or confidence, and urgent cards display the figure. The reasoning string now also states the units of demand expected to go unserved and their retail value, so a planner sees the size of the problem rather than only its existence.</w:t>
+      </w:r>
+    </w:p>
+    <w:p>
+      <w:pPr>
+        <w:pStyle w:val="Heading3"/>
+        <w:spacing w:after="100" w:before="220"/>
+      </w:pPr>
+      <w:r>
+        <w:t xml:space="preserve">B10. Open purchase orders in the data model</w:t>
+      </w:r>
+    </w:p>
+    <w:p>
+      <w:pPr>
+        <w:spacing w:after="120"/>
+      </w:pPr>
+      <w:r>
+        <w:rPr>
+          <w:sz w:val="21"/>
+          <w:szCs w:val="21"/>
+        </w:rPr>
+        <w:t xml:space="preserve">The inventory snapshot now records units already on order and when they arrive. Two behaviours depend on it: shortage alerts clear once stock is genuinely on its way, and reorder quantities are netted against inventory position rather than shelf stock. The dashboard shows in-flight orders alongside each recommendation.</w:t>
       </w:r>
     </w:p>
     <w:p>

</xml_diff>

<commit_message>
Exposure ranking, on-order modelling, autonomy floor, updated diagrams and docs
Exposure ranking, on-order modelling, autonomy floor, updated diagrams and docs
</commit_message>
<xml_diff>
--- a/Agentic_Replenishment_Change_Log.docx
+++ b/Agentic_Replenishment_Change_Log.docx
@@ -484,7 +484,7 @@
                 <w:sz w:val="20"/>
                 <w:szCs w:val="20"/>
               </w:rPr>
-              <w:t xml:space="preserve">14</w:t>
+              <w:t xml:space="preserve">16</w:t>
             </w:r>
           </w:p>
         </w:tc>
@@ -3376,7 +3376,41 @@
           <w:sz w:val="21"/>
           <w:szCs w:val="21"/>
         </w:rPr>
-        <w:t xml:space="preserve">No per-store inventory or fulfilment orchestration. Inventory is a single pooled figure per SKU, which excludes inventory deployment — work that legitimately belongs to replenishment.</w:t>
+        <w:t xml:space="preserve">BOPIS and BORIS were never considered in the design and are not modelled anywhere. BOPIS — buy online, pick up in store — reserves units against a named store for a named customer before collection, so on-hand stock and sellable stock stop being the same number. BORIS — buy online, return in store — returns units to a store's stock at an unpredictable time, and frequently not the store that fulfilled the order.</w:t>
+      </w:r>
+    </w:p>
+    <w:p>
+      <w:pPr>
+        <w:pStyle w:val="ListParagraph"/>
+        <w:numPr>
+          <w:ilvl w:val="0"/>
+          <w:numId w:val="2"/>
+        </w:numPr>
+        <w:spacing w:after="70"/>
+      </w:pPr>
+      <w:r>
+        <w:rPr>
+          <w:sz w:val="21"/>
+          <w:szCs w:val="21"/>
+        </w:rPr>
+        <w:t xml:space="preserve">The two distort the arithmetic in opposite directions. Unmodelled BOPIS reservations make available stock look larger than it is, so the system under-orders. Unmodelled BORIS returns make incoming supply look smaller than it is, so the system over-orders. Neither is representable while inventory is a single pooled figure with no per-store view.</w:t>
+      </w:r>
+    </w:p>
+    <w:p>
+      <w:pPr>
+        <w:pStyle w:val="ListParagraph"/>
+        <w:numPr>
+          <w:ilvl w:val="0"/>
+          <w:numId w:val="2"/>
+        </w:numPr>
+        <w:spacing w:after="70"/>
+      </w:pPr>
+      <w:r>
+        <w:rPr>
+          <w:sz w:val="21"/>
+          <w:szCs w:val="21"/>
+        </w:rPr>
+        <w:t xml:space="preserve">No per-store inventory or fulfilment orchestration. Inventory is a single pooled figure per SKU, which excludes inventory deployment — work that legitimately belongs to replenishment. Ship-from-store and cross-location transfers are out of scope for the same reason.</w:t>
       </w:r>
     </w:p>
     <w:p>

</xml_diff>